<commit_message>
Clarify image and firmware versions
</commit_message>
<xml_diff>
--- a/docs/reference/Huskey_Pocket_Documentacion_Tecnica_EN.docx
+++ b/docs/reference/Huskey_Pocket_Documentacion_Tecnica_EN.docx
@@ -833,36 +833,20 @@
           <w:sz w:val="21"/>
           <w:szCs w:val="21"/>
         </w:rPr>
-        <w:t xml:space="preserve">This </w:t>
-      </w:r>
+        <w:t>This document describes the internal structure of the Huskey Pocket firmware: how the code is organized, what each module does, and the public interfaces of key functions. It is a development reference that complements the security whitepaper. This document focuses on how the firmware works.</w:t>
+      </w:r>
+    </w:p>
+    <w:p>
+      <w:pPr>
+        <w:spacing w:after="120" w:line="276" w:lineRule="auto"/>
+      </w:pPr>
       <w:r>
         <w:rPr>
           <w:color w:val="222831"/>
           <w:sz w:val="21"/>
           <w:szCs w:val="21"/>
         </w:rPr>
-        <w:t>document describes the internal structure of the Huskey Pocket firmware: how the code is organized, what each module does, and the public interfaces of key functions. It is a development reference that complements the security whitepaper. This document focuses on how the firmware works.</w:t>
-      </w:r>
-    </w:p>
-    <w:p>
-      <w:pPr>
-        <w:spacing w:after="120" w:line="276" w:lineRule="auto"/>
-      </w:pPr>
-      <w:r>
-        <w:rPr>
-          <w:color w:val="222831"/>
-          <w:sz w:val="21"/>
-          <w:szCs w:val="21"/>
-        </w:rPr>
-        <w:t xml:space="preserve">The firmware is an Arduino/ESP-IDF project for the ESP32-S3, written in C++ and organized into headers (.h) by functional area, with a main sketch (.ino) coordinating startup and the main loop. The graphical </w:t>
-      </w:r>
-      <w:r>
-        <w:rPr>
-          <w:color w:val="222831"/>
-          <w:sz w:val="21"/>
-          <w:szCs w:val="21"/>
-        </w:rPr>
-        <w:t>interface uses LVGL. Encrypted storage uses mbedTLS, NVS, and LittleFS.</w:t>
+        <w:t>The firmware is an Arduino/ESP-IDF project for the ESP32-S3, written in C++ and organized into headers (.h) by functional area, with a main sketch (.ino) coordinating startup and the main loop. The graphical interface uses LVGL. Encrypted storage uses mbedTLS, NVS, and LittleFS.</w:t>
       </w:r>
     </w:p>
     <w:p>
@@ -1746,15 +1730,7 @@
                 <w:sz w:val="18"/>
                 <w:szCs w:val="18"/>
               </w:rPr>
-              <w:t xml:space="preserve">64 — maximum </w:t>
-            </w:r>
-            <w:r>
-              <w:rPr>
-                <w:color w:val="222831"/>
-                <w:sz w:val="18"/>
-                <w:szCs w:val="18"/>
-              </w:rPr>
-              <w:t>length for name, username, password, and secret</w:t>
+              <w:t>64 — maximum length for name, username, password, and secret</w:t>
             </w:r>
           </w:p>
         </w:tc>
@@ -2000,15 +1976,7 @@
           <w:szCs w:val="21"/>
         </w:rPr>
         <w:lastRenderedPageBreak/>
-        <w:t xml:space="preserve">The code is grouped into four </w:t>
-      </w:r>
-      <w:r>
-        <w:rPr>
-          <w:color w:val="222831"/>
-          <w:sz w:val="21"/>
-          <w:szCs w:val="21"/>
-        </w:rPr>
-        <w:t>conceptual layers. Individual files may cover more than one layer; the .ino file connects them.</w:t>
+        <w:t>The code is grouped into four conceptual layers. Individual files may cover more than one layer; the .ino file connects them.</w:t>
       </w:r>
     </w:p>
     <w:p>
@@ -2280,15 +2248,7 @@
           <w:sz w:val="21"/>
           <w:szCs w:val="21"/>
         </w:rPr>
-        <w:t xml:space="preserve">usb_msc_manager.h — USB mass-storage mode (exposes the SD card to the </w:t>
-      </w:r>
-      <w:r>
-        <w:rPr>
-          <w:color w:val="222831"/>
-          <w:sz w:val="21"/>
-          <w:szCs w:val="21"/>
-        </w:rPr>
-        <w:t>computer).</w:t>
+        <w:t>usb_msc_manager.h — USB mass-storage mode (exposes the SD card to the computer).</w:t>
       </w:r>
     </w:p>
     <w:p>
@@ -2505,16 +2465,7 @@
           <w:sz w:val="18"/>
           <w:szCs w:val="18"/>
         </w:rPr>
-        <w:t xml:space="preserve">if </w:t>
-      </w:r>
-      <w:r>
-        <w:rPr>
-          <w:rFonts w:ascii="Consolas" w:eastAsia="Consolas" w:hAnsi="Consolas" w:cs="Consolas"/>
-          <w:color w:val="1A1A2E"/>
-          <w:sz w:val="18"/>
-          <w:szCs w:val="18"/>
-        </w:rPr>
-        <w:t>(vault_get_usb_msc_mode()) {     // Initialize minimal LVGL and start usb_msc_begin();     return;   // exclusive mode: vault is not loaded }</w:t>
+        <w:t>if (vault_get_usb_msc_mode()) {     // Initialize minimal LVGL and start usb_msc_begin();     return;   // exclusive mode: vault is not loaded }</w:t>
       </w:r>
     </w:p>
     <w:p>
@@ -3120,16 +3071,117 @@
                 <w:sz w:val="18"/>
                 <w:szCs w:val="18"/>
               </w:rPr>
-              <w:t xml:space="preserve">void </w:t>
-            </w:r>
+              <w:t>void vault_lock()</w:t>
+            </w:r>
+          </w:p>
+        </w:tc>
+        <w:tc>
+          <w:tcPr>
+            <w:tcW w:w="5600" w:type="dxa"/>
+            <w:shd w:val="clear" w:color="auto" w:fill="EAF3F0"/>
+            <w:tcMar>
+              <w:top w:w="50" w:type="dxa"/>
+              <w:left w:w="100" w:type="dxa"/>
+              <w:bottom w:w="50" w:type="dxa"/>
+              <w:right w:w="100" w:type="dxa"/>
+            </w:tcMar>
+          </w:tcPr>
+          <w:p>
+            <w:pPr>
+              <w:spacing w:line="250" w:lineRule="auto"/>
+            </w:pPr>
+            <w:r>
+              <w:rPr>
+                <w:color w:val="222831"/>
+                <w:sz w:val="18"/>
+                <w:szCs w:val="18"/>
+              </w:rPr>
+              <w:t>Clears the key from RAM and closes the session.</w:t>
+            </w:r>
+          </w:p>
+        </w:tc>
+      </w:tr>
+      <w:tr>
+        <w:tc>
+          <w:tcPr>
+            <w:tcW w:w="3400" w:type="dxa"/>
+            <w:shd w:val="clear" w:color="auto" w:fill="FFFFFF"/>
+            <w:tcMar>
+              <w:top w:w="50" w:type="dxa"/>
+              <w:left w:w="100" w:type="dxa"/>
+              <w:bottom w:w="50" w:type="dxa"/>
+              <w:right w:w="100" w:type="dxa"/>
+            </w:tcMar>
+          </w:tcPr>
+          <w:p>
+            <w:pPr>
+              <w:spacing w:line="250" w:lineRule="auto"/>
+              <w:rPr>
+                <w:lang w:val="en-US"/>
+              </w:rPr>
+            </w:pPr>
             <w:r>
               <w:rPr>
                 <w:rFonts w:ascii="Consolas" w:eastAsia="Consolas" w:hAnsi="Consolas" w:cs="Consolas"/>
                 <w:color w:val="0A3D2E"/>
                 <w:sz w:val="18"/>
                 <w:szCs w:val="18"/>
-              </w:rPr>
-              <w:t>vault_lock()</w:t>
+                <w:lang w:val="en-US"/>
+              </w:rPr>
+              <w:t>bool vault_verify_pin(pin)</w:t>
+            </w:r>
+          </w:p>
+        </w:tc>
+        <w:tc>
+          <w:tcPr>
+            <w:tcW w:w="5600" w:type="dxa"/>
+            <w:shd w:val="clear" w:color="auto" w:fill="FFFFFF"/>
+            <w:tcMar>
+              <w:top w:w="50" w:type="dxa"/>
+              <w:left w:w="100" w:type="dxa"/>
+              <w:bottom w:w="50" w:type="dxa"/>
+              <w:right w:w="100" w:type="dxa"/>
+            </w:tcMar>
+          </w:tcPr>
+          <w:p>
+            <w:pPr>
+              <w:spacing w:line="250" w:lineRule="auto"/>
+            </w:pPr>
+            <w:r>
+              <w:rPr>
+                <w:color w:val="222831"/>
+                <w:sz w:val="18"/>
+                <w:szCs w:val="18"/>
+              </w:rPr>
+              <w:t>Checks a real or decoy PIN without changing the active session; used before sensitive actions.</w:t>
+            </w:r>
+          </w:p>
+        </w:tc>
+      </w:tr>
+      <w:tr>
+        <w:tc>
+          <w:tcPr>
+            <w:tcW w:w="3400" w:type="dxa"/>
+            <w:shd w:val="clear" w:color="auto" w:fill="EAF3F0"/>
+            <w:tcMar>
+              <w:top w:w="50" w:type="dxa"/>
+              <w:left w:w="100" w:type="dxa"/>
+              <w:bottom w:w="50" w:type="dxa"/>
+              <w:right w:w="100" w:type="dxa"/>
+            </w:tcMar>
+          </w:tcPr>
+          <w:p>
+            <w:pPr>
+              <w:spacing w:line="250" w:lineRule="auto"/>
+            </w:pPr>
+            <w:r>
+              <w:rPr>
+                <w:rFonts w:ascii="Consolas" w:eastAsia="Consolas" w:hAnsi="Consolas" w:cs="Consolas"/>
+                <w:color w:val="0A3D2E"/>
+                <w:sz w:val="18"/>
+                <w:szCs w:val="18"/>
+              </w:rPr>
+              <w:t>bool vault_is_ready()</w:t>
             </w:r>
           </w:p>
         </w:tc>
@@ -3154,7 +3206,7 @@
                 <w:sz w:val="18"/>
                 <w:szCs w:val="18"/>
               </w:rPr>
-              <w:t>Clears the key from RAM and closes the session.</w:t>
+              <w:t>Indicates whether a vault is unlocked.</w:t>
             </w:r>
           </w:p>
         </w:tc>
@@ -3174,9 +3226,6 @@
           <w:p>
             <w:pPr>
               <w:spacing w:line="250" w:lineRule="auto"/>
-              <w:rPr>
-                <w:lang w:val="en-US"/>
-              </w:rPr>
             </w:pPr>
             <w:r>
               <w:rPr>
@@ -3184,124 +3233,8 @@
                 <w:color w:val="0A3D2E"/>
                 <w:sz w:val="18"/>
                 <w:szCs w:val="18"/>
-                <w:lang w:val="en-US"/>
-              </w:rPr>
-              <w:t>bool vault_verify_pin(pin)</w:t>
-            </w:r>
-          </w:p>
-        </w:tc>
-        <w:tc>
-          <w:tcPr>
-            <w:tcW w:w="5600" w:type="dxa"/>
-            <w:shd w:val="clear" w:color="auto" w:fill="FFFFFF"/>
-            <w:tcMar>
-              <w:top w:w="50" w:type="dxa"/>
-              <w:left w:w="100" w:type="dxa"/>
-              <w:bottom w:w="50" w:type="dxa"/>
-              <w:right w:w="100" w:type="dxa"/>
-            </w:tcMar>
-          </w:tcPr>
-          <w:p>
-            <w:pPr>
-              <w:spacing w:line="250" w:lineRule="auto"/>
-            </w:pPr>
-            <w:r>
-              <w:rPr>
-                <w:color w:val="222831"/>
-                <w:sz w:val="18"/>
-                <w:szCs w:val="18"/>
-              </w:rPr>
-              <w:t>Checks a real or decoy PIN without changing the active session; used before sensitive actions.</w:t>
-            </w:r>
-          </w:p>
-        </w:tc>
-      </w:tr>
-      <w:tr>
-        <w:tc>
-          <w:tcPr>
-            <w:tcW w:w="3400" w:type="dxa"/>
-            <w:shd w:val="clear" w:color="auto" w:fill="EAF3F0"/>
-            <w:tcMar>
-              <w:top w:w="50" w:type="dxa"/>
-              <w:left w:w="100" w:type="dxa"/>
-              <w:bottom w:w="50" w:type="dxa"/>
-              <w:right w:w="100" w:type="dxa"/>
-            </w:tcMar>
-          </w:tcPr>
-          <w:p>
-            <w:pPr>
-              <w:spacing w:line="250" w:lineRule="auto"/>
-            </w:pPr>
-            <w:r>
-              <w:rPr>
-                <w:rFonts w:ascii="Consolas" w:eastAsia="Consolas" w:hAnsi="Consolas" w:cs="Consolas"/>
-                <w:color w:val="0A3D2E"/>
-                <w:sz w:val="18"/>
-                <w:szCs w:val="18"/>
-              </w:rPr>
-              <w:t>bool vault_is_ready()</w:t>
-            </w:r>
-          </w:p>
-        </w:tc>
-        <w:tc>
-          <w:tcPr>
-            <w:tcW w:w="5600" w:type="dxa"/>
-            <w:shd w:val="clear" w:color="auto" w:fill="EAF3F0"/>
-            <w:tcMar>
-              <w:top w:w="50" w:type="dxa"/>
-              <w:left w:w="100" w:type="dxa"/>
-              <w:bottom w:w="50" w:type="dxa"/>
-              <w:right w:w="100" w:type="dxa"/>
-            </w:tcMar>
-          </w:tcPr>
-          <w:p>
-            <w:pPr>
-              <w:spacing w:line="250" w:lineRule="auto"/>
-            </w:pPr>
-            <w:r>
-              <w:rPr>
-                <w:color w:val="222831"/>
-                <w:sz w:val="18"/>
-                <w:szCs w:val="18"/>
-              </w:rPr>
-              <w:t>Indicates whether a vault is unlocked.</w:t>
-            </w:r>
-          </w:p>
-        </w:tc>
-      </w:tr>
-      <w:tr>
-        <w:tc>
-          <w:tcPr>
-            <w:tcW w:w="3400" w:type="dxa"/>
-            <w:shd w:val="clear" w:color="auto" w:fill="FFFFFF"/>
-            <w:tcMar>
-              <w:top w:w="50" w:type="dxa"/>
-              <w:left w:w="100" w:type="dxa"/>
-              <w:bottom w:w="50" w:type="dxa"/>
-              <w:right w:w="100" w:type="dxa"/>
-            </w:tcMar>
-          </w:tcPr>
-          <w:p>
-            <w:pPr>
-              <w:spacing w:line="250" w:lineRule="auto"/>
-            </w:pPr>
-            <w:r>
-              <w:rPr>
-                <w:rFonts w:ascii="Consolas" w:eastAsia="Consolas" w:hAnsi="Consolas" w:cs="Consolas"/>
-                <w:color w:val="0A3D2E"/>
-                <w:sz w:val="18"/>
-                <w:szCs w:val="18"/>
-              </w:rPr>
-              <w:t xml:space="preserve">bool </w:t>
-            </w:r>
-            <w:r>
-              <w:rPr>
-                <w:rFonts w:ascii="Consolas" w:eastAsia="Consolas" w:hAnsi="Consolas" w:cs="Consolas"/>
-                <w:color w:val="0A3D2E"/>
-                <w:sz w:val="18"/>
-                <w:szCs w:val="18"/>
-              </w:rPr>
-              <w:t>vault_is_decoy()</w:t>
+              </w:rPr>
+              <w:t>bool vault_is_decoy()</w:t>
             </w:r>
           </w:p>
         </w:tc>
@@ -4074,15 +4007,7 @@
                 <w:sz w:val="18"/>
                 <w:szCs w:val="18"/>
               </w:rPr>
-              <w:t xml:space="preserve">Set, </w:t>
-            </w:r>
-            <w:r>
-              <w:rPr>
-                <w:color w:val="222831"/>
-                <w:sz w:val="18"/>
-                <w:szCs w:val="18"/>
-              </w:rPr>
-              <w:t>remove, and check whether a decoy PIN is configured.</w:t>
+              <w:t>Set, remove, and check whether a decoy PIN is configured.</w:t>
             </w:r>
           </w:p>
         </w:tc>
@@ -4676,15 +4601,7 @@
                 <w:sz w:val="18"/>
                 <w:szCs w:val="18"/>
               </w:rPr>
-              <w:t xml:space="preserve">Count entries with </w:t>
-            </w:r>
-            <w:r>
-              <w:rPr>
-                <w:color w:val="222831"/>
-                <w:sz w:val="18"/>
-                <w:szCs w:val="18"/>
-              </w:rPr>
-              <w:t>optional filters.</w:t>
+              <w:t>Count entries with optional filters.</w:t>
             </w:r>
           </w:p>
         </w:tc>
@@ -4948,15 +4865,7 @@
                 <w:sz w:val="18"/>
                 <w:szCs w:val="18"/>
               </w:rPr>
-              <w:t xml:space="preserve">Calculate an entry’s six-digit TOTP </w:t>
-            </w:r>
-            <w:r>
-              <w:rPr>
-                <w:color w:val="222831"/>
-                <w:sz w:val="18"/>
-                <w:szCs w:val="18"/>
-              </w:rPr>
-              <w:t>code. The secret and code are not written to diagnostics.</w:t>
+              <w:t>Calculate an entry’s six-digit TOTP code. The secret and code are not written to diagnostics.</w:t>
             </w:r>
           </w:p>
         </w:tc>
@@ -5090,15 +4999,7 @@
           <w:iCs/>
           <w:color w:val="3A4250"/>
         </w:rPr>
-        <w:t xml:space="preserve">The vault uses a hash table on LittleFS with linear probing. Each lookup opens and decrypts records along the probe chain, so performance degrades as the table approaches capacity. This is a known backend </w:t>
-      </w:r>
-      <w:r>
-        <w:rPr>
-          <w:i/>
-          <w:iCs/>
-          <w:color w:val="3A4250"/>
-        </w:rPr>
-        <w:t>trade-off.</w:t>
+        <w:t>The vault uses a hash table on LittleFS with linear probing. Each lookup opens and decrypts records along the probe chain, so performance degrades as the table approaches capacity. This is a known backend trade-off.</w:t>
       </w:r>
     </w:p>
     <w:p>
@@ -5145,15 +5046,7 @@
           <w:sz w:val="21"/>
           <w:szCs w:val="21"/>
         </w:rPr>
-        <w:t xml:space="preserve">Implements CSV import and export. The parser follows RFC 4180 (quoted fields and escaped double quotes) and automatically detects the delimiter and header format </w:t>
-      </w:r>
-      <w:r>
-        <w:rPr>
-          <w:color w:val="222831"/>
-          <w:sz w:val="21"/>
-          <w:szCs w:val="21"/>
-        </w:rPr>
-        <w:t>(Huskey or browser). Import is incremental: a UI timer processes a few lines per call so the touchscreen remains responsive during large imports.</w:t>
+        <w:t>Implements CSV import and export. The parser follows RFC 4180 (quoted fields and escaped double quotes) and automatically detects the delimiter and header format (Huskey or browser). Import is incremental: a UI timer processes a few lines per call so the touchscreen remains responsive during large imports.</w:t>
       </w:r>
     </w:p>
     <w:tbl>
@@ -5451,15 +5344,7 @@
                 <w:sz w:val="18"/>
                 <w:szCs w:val="18"/>
               </w:rPr>
-              <w:t xml:space="preserve">Report progress: imported rows, </w:t>
-            </w:r>
-            <w:r>
-              <w:rPr>
-                <w:color w:val="222831"/>
-                <w:sz w:val="18"/>
-                <w:szCs w:val="18"/>
-              </w:rPr>
-              <w:t>errors, processed lines, and total.</w:t>
+              <w:t>Report progress: imported rows, errors, processed lines, and total.</w:t>
             </w:r>
           </w:p>
         </w:tc>
@@ -5570,15 +5455,7 @@
           <w:sz w:val="21"/>
           <w:szCs w:val="21"/>
         </w:rPr>
-        <w:t xml:space="preserve">Implements the encrypted .hky container. Export derives a key from the export password (separate from the PIN) and writes a format header </w:t>
-      </w:r>
-      <w:r>
-        <w:rPr>
-          <w:color w:val="222831"/>
-          <w:sz w:val="21"/>
-          <w:szCs w:val="21"/>
-        </w:rPr>
-        <w:t xml:space="preserve">containing a salt, iteration count, and IV, followed by streamed ciphertext beginning with a fixed verification block. Import decrypts on the fly and feeds the same CSV parser without </w:t>
+        <w:t xml:space="preserve">Implements the encrypted .hky container. Export derives a key from the export password (separate from the PIN) and writes a format header containing a salt, iteration count, and IV, followed by streamed ciphertext beginning with a fixed verification block. Import decrypts on the fly and feeds the same CSV parser without </w:t>
       </w:r>
       <w:r>
         <w:rPr>
@@ -5779,15 +5656,7 @@
                 <w:sz w:val="18"/>
                 <w:szCs w:val="18"/>
               </w:rPr>
-              <w:t xml:space="preserve">Open and validate the container, then prepare </w:t>
-            </w:r>
-            <w:r>
-              <w:rPr>
-                <w:color w:val="222831"/>
-                <w:sz w:val="18"/>
-                <w:szCs w:val="18"/>
-              </w:rPr>
-              <w:t>streaming decryption.</w:t>
+              <w:t>Open and validate the container, then prepare streaming decryption.</w:t>
             </w:r>
           </w:p>
         </w:tc>
@@ -5898,15 +5767,7 @@
           <w:sz w:val="21"/>
           <w:szCs w:val="21"/>
         </w:rPr>
-        <w:t xml:space="preserve">Emulates a BLE HID keyboard using NimBLE. Pairing uses numeric </w:t>
-      </w:r>
-      <w:r>
-        <w:rPr>
-          <w:color w:val="222831"/>
-          <w:sz w:val="21"/>
-          <w:szCs w:val="21"/>
-        </w:rPr>
-        <w:t>confirmation: a six-digit code is displayed for the user to confirm on screen. Keystrokes are sent only over an encrypted and authenticated link.</w:t>
+        <w:t>Emulates a BLE HID keyboard using NimBLE. Pairing uses numeric confirmation: a six-digit code is displayed for the user to confirm on screen. Keystrokes are sent only over an encrypted and authenticated link.</w:t>
       </w:r>
     </w:p>
     <w:tbl>
@@ -6787,15 +6648,7 @@
           <w:sz w:val="21"/>
           <w:szCs w:val="21"/>
         </w:rPr>
-        <w:t xml:space="preserve">Controls the PCF85063ATL RTC over I2C. An external backup battery is required to retain time when main power is removed. This is the </w:t>
-      </w:r>
-      <w:r>
-        <w:rPr>
-          <w:color w:val="222831"/>
-          <w:sz w:val="21"/>
-          <w:szCs w:val="21"/>
-        </w:rPr>
-        <w:t>vault’s only time source, used by TOTP and Lost Mode. Writes validate all ranges; reads mask status bits.</w:t>
+        <w:t>Controls the PCF85063ATL RTC over I2C. An external backup battery is required to retain time when main power is removed. This is the vault’s only time source, used by TOTP and Lost Mode. Writes validate all ranges; reads mask status bits.</w:t>
       </w:r>
     </w:p>
     <w:tbl>
@@ -6983,15 +6836,7 @@
                 <w:sz w:val="18"/>
                 <w:szCs w:val="18"/>
               </w:rPr>
-              <w:t xml:space="preserve">Set the </w:t>
-            </w:r>
-            <w:r>
-              <w:rPr>
-                <w:color w:val="222831"/>
-                <w:sz w:val="18"/>
-                <w:szCs w:val="18"/>
-              </w:rPr>
-              <w:t>time after validating each range.</w:t>
+              <w:t>Set the time after validating each range.</w:t>
             </w:r>
           </w:p>
         </w:tc>
@@ -7173,17 +7018,7 @@
           <w:sz w:val="24"/>
           <w:szCs w:val="24"/>
         </w:rPr>
-        <w:t xml:space="preserve">snatch_lock.h — </w:t>
-      </w:r>
-      <w:r>
-        <w:rPr>
-          <w:b/>
-          <w:bCs/>
-          <w:color w:val="0E7C66"/>
-          <w:sz w:val="24"/>
-          <w:szCs w:val="24"/>
-        </w:rPr>
-        <w:t>Snatch Lock</w:t>
+        <w:t>snatch_lock.h — Snatch Lock</w:t>
       </w:r>
     </w:p>
     <w:p>
@@ -7380,15 +7215,7 @@
                 <w:sz w:val="18"/>
                 <w:szCs w:val="18"/>
               </w:rPr>
-              <w:t xml:space="preserve">Called on each loop iteration; checks for a snatch when </w:t>
-            </w:r>
-            <w:r>
-              <w:rPr>
-                <w:color w:val="222831"/>
-                <w:sz w:val="18"/>
-                <w:szCs w:val="18"/>
-              </w:rPr>
-              <w:t>enabled and the vault is unlocked.</w:t>
+              <w:t>Called on each loop iteration; checks for a snatch when enabled and the vault is unlocked.</w:t>
             </w:r>
           </w:p>
         </w:tc>
@@ -8230,15 +8057,7 @@
                 <w:sz w:val="18"/>
                 <w:szCs w:val="18"/>
               </w:rPr>
-              <w:t xml:space="preserve">Password generator with </w:t>
-            </w:r>
-            <w:r>
-              <w:rPr>
-                <w:color w:val="222831"/>
-                <w:sz w:val="18"/>
-                <w:szCs w:val="18"/>
-              </w:rPr>
-              <w:t>length and character-set options.</w:t>
+              <w:t>Password generator with length and character-set options.</w:t>
             </w:r>
           </w:p>
         </w:tc>
@@ -8502,15 +8321,7 @@
                 <w:sz w:val="18"/>
                 <w:szCs w:val="18"/>
               </w:rPr>
-              <w:t xml:space="preserve">ES/EN </w:t>
-            </w:r>
-            <w:r>
-              <w:rPr>
-                <w:color w:val="222831"/>
-                <w:sz w:val="18"/>
-                <w:szCs w:val="18"/>
-              </w:rPr>
-              <w:t>localization through key-indexed tables.</w:t>
+              <w:t>ES/EN localization through key-indexed tables.</w:t>
             </w:r>
           </w:p>
         </w:tc>
@@ -8635,15 +8446,7 @@
           <w:sz w:val="21"/>
           <w:szCs w:val="21"/>
         </w:rPr>
-        <w:t xml:space="preserve">Some security invariants span multiple modules rather than living in a single one. Keep these in mind when changing any </w:t>
-      </w:r>
-      <w:r>
-        <w:rPr>
-          <w:color w:val="222831"/>
-          <w:sz w:val="21"/>
-          <w:szCs w:val="21"/>
-        </w:rPr>
-        <w:t>part of the code:</w:t>
+        <w:t>Some security invariants span multiple modules rather than living in a single one. Keep these in mind when changing any part of the code:</w:t>
       </w:r>
     </w:p>
     <w:p>
@@ -8716,15 +8519,7 @@
           <w:sz w:val="21"/>
           <w:szCs w:val="21"/>
         </w:rPr>
-        <w:t xml:space="preserve">Real and decoy PIN </w:t>
-      </w:r>
-      <w:r>
-        <w:rPr>
-          <w:color w:val="222831"/>
-          <w:sz w:val="21"/>
-          <w:szCs w:val="21"/>
-        </w:rPr>
-        <w:t>verification should take constant time relative to one another to avoid revealing which was entered.</w:t>
+        <w:t>Real and decoy PIN verification should take constant time relative to one another to avoid revealing which was entered.</w:t>
       </w:r>
     </w:p>
     <w:p>
@@ -8825,7 +8620,48 @@
         <w:sz w:val="16"/>
         <w:szCs w:val="16"/>
       </w:rPr>
-      <w:t>Page 1</w:t>
+      <w:t xml:space="preserve">Page </w:t>
+    </w:r>
+    <w:r>
+      <w:rPr>
+        <w:color w:val="5B6270"/>
+        <w:sz w:val="16"/>
+        <w:szCs w:val="16"/>
+      </w:rPr>
+      <w:fldChar w:fldCharType="begin"/>
+    </w:r>
+    <w:r>
+      <w:rPr>
+        <w:color w:val="5B6270"/>
+        <w:sz w:val="16"/>
+        <w:szCs w:val="16"/>
+      </w:rPr>
+      <w:instrText>PAGE</w:instrText>
+    </w:r>
+    <w:r>
+      <w:rPr>
+        <w:color w:val="5B6270"/>
+        <w:sz w:val="16"/>
+        <w:szCs w:val="16"/>
+      </w:rPr>
+      <w:fldChar w:fldCharType="separate"/>
+    </w:r>
+    <w:r>
+      <w:rPr>
+        <w:noProof/>
+        <w:color w:val="5B6270"/>
+        <w:sz w:val="16"/>
+        <w:szCs w:val="16"/>
+      </w:rPr>
+      <w:t>1</w:t>
+    </w:r>
+    <w:r>
+      <w:rPr>
+        <w:color w:val="5B6270"/>
+        <w:sz w:val="16"/>
+        <w:szCs w:val="16"/>
+      </w:rPr>
+      <w:fldChar w:fldCharType="end"/>
     </w:r>
   </w:p>
 </w:ftr>
@@ -8833,7 +8669,60 @@
 
 <file path=word/footer2.xml><?xml version="1.0" encoding="utf-8"?>
 <w:ftr xmlns:wpc="http://schemas.microsoft.com/office/word/2010/wordprocessingCanvas" xmlns:cx="http://schemas.microsoft.com/office/drawing/2014/chartex" xmlns:cx1="http://schemas.microsoft.com/office/drawing/2015/9/8/chartex" xmlns:cx2="http://schemas.microsoft.com/office/drawing/2015/10/21/chartex" xmlns:cx3="http://schemas.microsoft.com/office/drawing/2016/5/9/chartex" xmlns:cx4="http://schemas.microsoft.com/office/drawing/2016/5/10/chartex" xmlns:cx5="http://schemas.microsoft.com/office/drawing/2016/5/11/chartex" xmlns:cx6="http://schemas.microsoft.com/office/drawing/2016/5/12/chartex" xmlns:cx7="http://schemas.microsoft.com/office/drawing/2016/5/13/chartex" xmlns:cx8="http://schemas.microsoft.com/office/drawing/2016/5/14/chartex" xmlns:mc="http://schemas.openxmlformats.org/markup-compatibility/2006" xmlns:aink="http://schemas.microsoft.com/office/drawing/2016/ink" xmlns:am3d="http://schemas.microsoft.com/office/drawing/2017/model3d" xmlns:o="urn:schemas-microsoft-com:office:office" xmlns:oel="http://schemas.microsoft.com/office/2019/extlst" xmlns:r="http://schemas.openxmlformats.org/officeDocument/2006/relationships" xmlns:m="http://schemas.openxmlformats.org/officeDocument/2006/math" xmlns:v="urn:schemas-microsoft-com:vml" xmlns:wp14="http://schemas.microsoft.com/office/word/2010/wordprocessingDrawing" xmlns:wp="http://schemas.openxmlformats.org/drawingml/2006/wordprocessingDrawing" xmlns:w10="urn:schemas-microsoft-com:office:word" xmlns:w="http://schemas.openxmlformats.org/wordprocessingml/2006/main" xmlns:w14="http://schemas.microsoft.com/office/word/2010/wordml" xmlns:w15="http://schemas.microsoft.com/office/word/2012/wordml" xmlns:w16cex="http://schemas.microsoft.com/office/word/2018/wordml/cex" xmlns:w16cid="http://schemas.microsoft.com/office/word/2016/wordml/cid" xmlns:w16="http://schemas.microsoft.com/office/word/2018/wordml" xmlns:w16sdtdh="http://schemas.microsoft.com/office/word/2020/wordml/sdtdatahash" xmlns:w16se="http://schemas.microsoft.com/office/word/2015/wordml/symex" xmlns:wpg="http://schemas.microsoft.com/office/word/2010/wordprocessingGroup" xmlns:wpi="http://schemas.microsoft.com/office/word/2010/wordprocessingInk" xmlns:wne="http://schemas.microsoft.com/office/word/2006/wordml" xmlns:wps="http://schemas.microsoft.com/office/word/2010/wordprocessingShape" mc:Ignorable="w14 w15 w16se w16cid w16 w16cex w16sdtdh wp14">
-  <w:p/>
+  <w:p>
+    <w:pPr>
+      <w:jc w:val="center"/>
+    </w:pPr>
+    <w:r>
+      <w:rPr>
+        <w:color w:val="5B6270"/>
+        <w:sz w:val="16"/>
+        <w:szCs w:val="16"/>
+      </w:rPr>
+      <w:t xml:space="preserve">Page </w:t>
+    </w:r>
+    <w:r>
+      <w:rPr>
+        <w:color w:val="5B6270"/>
+        <w:sz w:val="16"/>
+        <w:szCs w:val="16"/>
+      </w:rPr>
+      <w:fldChar w:fldCharType="begin"/>
+    </w:r>
+    <w:r>
+      <w:rPr>
+        <w:color w:val="5B6270"/>
+        <w:sz w:val="16"/>
+        <w:szCs w:val="16"/>
+      </w:rPr>
+      <w:instrText>PAGE</w:instrText>
+    </w:r>
+    <w:r>
+      <w:rPr>
+        <w:color w:val="5B6270"/>
+        <w:sz w:val="16"/>
+        <w:szCs w:val="16"/>
+      </w:rPr>
+      <w:fldChar w:fldCharType="separate"/>
+    </w:r>
+    <w:r>
+      <w:rPr>
+        <w:noProof/>
+        <w:color w:val="5B6270"/>
+        <w:sz w:val="16"/>
+        <w:szCs w:val="16"/>
+      </w:rPr>
+      <w:t>1</w:t>
+    </w:r>
+    <w:r>
+      <w:rPr>
+        <w:color w:val="5B6270"/>
+        <w:sz w:val="16"/>
+        <w:szCs w:val="16"/>
+      </w:rPr>
+      <w:fldChar w:fldCharType="end"/>
+    </w:r>
+  </w:p>
 </w:ftr>
 </file>
 
@@ -8871,15 +8760,7 @@
         <w:sz w:val="16"/>
         <w:szCs w:val="16"/>
       </w:rPr>
-      <w:t xml:space="preserve">Huskey Pocket — </w:t>
-    </w:r>
-    <w:r>
-      <w:rPr>
-        <w:color w:val="5B6270"/>
-        <w:sz w:val="16"/>
-        <w:szCs w:val="16"/>
-      </w:rPr>
-      <w:t>Firmware Technical Documentation</w:t>
+      <w:t>Huskey Pocket — Firmware Technical Documentation</w:t>
     </w:r>
   </w:p>
 </w:hdr>

</xml_diff>